<commit_message>
Atualizado Trabalho integrador TEMPLATE
</commit_message>
<xml_diff>
--- a/TRABALHO INTEGRADOR TEMPLATE.docx
+++ b/TRABALHO INTEGRADOR TEMPLATE.docx
@@ -112,7 +112,21 @@
           <w:rFonts w:cs="Arial"/>
           <w:szCs w:val="24"/>
         </w:rPr>
-        <w:t>DESENVOLVEDO DE SISTEMAS</w:t>
+        <w:t>DESENVOLVEDO</w:t>
+      </w:r>
+      <w:r>
+        <w:rPr>
+          <w:rFonts w:cs="Arial"/>
+          <w:szCs w:val="24"/>
+        </w:rPr>
+        <w:t>R</w:t>
+      </w:r>
+      <w:r>
+        <w:rPr>
+          <w:rFonts w:cs="Arial"/>
+          <w:szCs w:val="24"/>
+        </w:rPr>
+        <w:t xml:space="preserve"> DE SISTEMAS</w:t>
       </w:r>
     </w:p>
     <w:p>
@@ -651,15 +665,156 @@
         <w:jc w:val="both"/>
       </w:pPr>
       <w:r>
-        <w:t>Pensando na sustentabilidade e evitando o desperdício de alimentos não comercializados no dia pela cantina ALAMO, desenvolvemos o sistema para gestão desses produtos, que visa comunicar os consumidores no final do horário letivo.</w:t>
-      </w:r>
-    </w:p>
-    <w:p>
-      <w:pPr>
-        <w:jc w:val="both"/>
-      </w:pPr>
-      <w:r>
-        <w:t>O sistema será utilizado por alunos e funcionários do SENAC, onde será enviado o cardápio do dia, e além dos produtos remanescentes do estoque que seria a o problema principal que a aplicação iria resolver.</w:t>
+        <w:t xml:space="preserve">Pensando na sustentabilidade </w:t>
+      </w:r>
+      <w:r>
+        <w:t>para evitar</w:t>
+      </w:r>
+      <w:r>
+        <w:t xml:space="preserve"> o desperdício de alimentos não comercializados no dia pela cantina ALAMO, </w:t>
+      </w:r>
+      <w:r>
+        <w:t>decidimos desenvolver</w:t>
+      </w:r>
+      <w:r>
+        <w:t xml:space="preserve"> </w:t>
+      </w:r>
+      <w:r>
+        <w:t>um</w:t>
+      </w:r>
+      <w:r>
+        <w:t xml:space="preserve"> sistema para gestão des</w:t>
+      </w:r>
+      <w:r>
+        <w:t>t</w:t>
+      </w:r>
+      <w:r>
+        <w:t xml:space="preserve">es produtos, que visa comunicar </w:t>
+      </w:r>
+      <w:r>
+        <w:t>aos</w:t>
+      </w:r>
+      <w:r>
+        <w:t xml:space="preserve"> </w:t>
+      </w:r>
+      <w:r>
+        <w:t>consumidores que produtos que sobraram serão vendidos num valor reduzido</w:t>
+      </w:r>
+      <w:r>
+        <w:t xml:space="preserve"> </w:t>
+      </w:r>
+      <w:r>
+        <w:t>próximo do horário de fechamento da cantina</w:t>
+      </w:r>
+      <w:r>
+        <w:t>.</w:t>
+      </w:r>
+    </w:p>
+    <w:p>
+      <w:pPr>
+        <w:jc w:val="both"/>
+      </w:pPr>
+      <w:r>
+        <w:t>O sistema será utilizado por alunos e funcionários do SENAC</w:t>
+      </w:r>
+      <w:r>
+        <w:t>.</w:t>
+      </w:r>
+    </w:p>
+    <w:p>
+      <w:pPr>
+        <w:jc w:val="both"/>
+      </w:pPr>
+      <w:r>
+        <w:t>Um dos requisitos não funcionais que decidimos implementar no sistema s</w:t>
+      </w:r>
+      <w:r>
+        <w:t xml:space="preserve">erá </w:t>
+      </w:r>
+      <w:r>
+        <w:t>o envio do</w:t>
+      </w:r>
+      <w:r>
+        <w:t xml:space="preserve"> cardápio do dia,</w:t>
+      </w:r>
+      <w:r>
+        <w:t xml:space="preserve"> e suas quantidades disponíveis</w:t>
+      </w:r>
+      <w:r>
+        <w:t xml:space="preserve"> e a possibilidade de reservar o produto.</w:t>
+      </w:r>
+      <w:r>
+        <w:t xml:space="preserve"> </w:t>
+      </w:r>
+      <w:r>
+        <w:t>P</w:t>
+      </w:r>
+      <w:r>
+        <w:t xml:space="preserve">ara que os alunos possam escolher o que irão consumir sem ter de ficar na fila, assim economizando tempo e por </w:t>
+      </w:r>
+      <w:r>
+        <w:t>consequência</w:t>
+      </w:r>
+      <w:r>
+        <w:t xml:space="preserve">, talvez aumente o </w:t>
+      </w:r>
+      <w:r>
+        <w:t>movimento na cantina</w:t>
+      </w:r>
+      <w:r>
+        <w:t>, visto que analisamos</w:t>
+      </w:r>
+      <w:r>
+        <w:t xml:space="preserve"> durantes as aulas</w:t>
+      </w:r>
+      <w:r>
+        <w:t xml:space="preserve"> </w:t>
+      </w:r>
+      <w:r>
+        <w:t>e notamos</w:t>
+      </w:r>
+      <w:r>
+        <w:t xml:space="preserve"> </w:t>
+      </w:r>
+      <w:r>
+        <w:t>uma quantidade considerável de pessoas desiste de comprar para não ter de ficar vários minutos esperando na fila</w:t>
+      </w:r>
+      <w:r>
+        <w:t>.</w:t>
+      </w:r>
+    </w:p>
+    <w:p>
+      <w:pPr>
+        <w:jc w:val="both"/>
+      </w:pPr>
+      <w:r>
+        <w:t>Se for possível tentaremos adicionar um</w:t>
+      </w:r>
+      <w:r>
+        <w:t>a funcionalidade</w:t>
+      </w:r>
+      <w:r>
+        <w:t xml:space="preserve"> n</w:t>
+      </w:r>
+      <w:r>
+        <w:t>a</w:t>
+      </w:r>
+      <w:r>
+        <w:t xml:space="preserve"> qual os alunos possam pagar online e</w:t>
+      </w:r>
+      <w:r>
+        <w:t xml:space="preserve"> ir</w:t>
+      </w:r>
+      <w:r>
+        <w:t xml:space="preserve"> </w:t>
+      </w:r>
+      <w:proofErr w:type="gramStart"/>
+      <w:r>
+        <w:t>na</w:t>
+      </w:r>
+      <w:proofErr w:type="gramEnd"/>
+      <w:r>
+        <w:t xml:space="preserve"> cantina apenas para coletar o pedido que já estará pronto e pago.</w:t>
       </w:r>
     </w:p>
     <w:p>
@@ -682,46 +837,418 @@
           <w:shd w:val="clear" w:color="auto" w:fill="FFFFFF"/>
         </w:rPr>
       </w:pPr>
-      <w:r>
-        <w:rPr>
-          <w:shd w:val="clear" w:color="auto" w:fill="FFFFFF"/>
-        </w:rPr>
+    </w:p>
+    <w:p>
+      <w:pPr>
+        <w:jc w:val="both"/>
+        <w:rPr>
+          <w:shd w:val="clear" w:color="auto" w:fill="FFFFFF"/>
+        </w:rPr>
+      </w:pPr>
+    </w:p>
+    <w:p>
+      <w:pPr>
+        <w:jc w:val="both"/>
+        <w:rPr>
+          <w:shd w:val="clear" w:color="auto" w:fill="FFFFFF"/>
+        </w:rPr>
+      </w:pPr>
+    </w:p>
+    <w:p>
+      <w:pPr>
+        <w:jc w:val="both"/>
+        <w:rPr>
+          <w:shd w:val="clear" w:color="auto" w:fill="FFFFFF"/>
+        </w:rPr>
+      </w:pPr>
+    </w:p>
+    <w:p>
+      <w:pPr>
+        <w:jc w:val="both"/>
+        <w:rPr>
+          <w:shd w:val="clear" w:color="auto" w:fill="FFFFFF"/>
+        </w:rPr>
+      </w:pPr>
+    </w:p>
+    <w:p>
+      <w:pPr>
+        <w:jc w:val="both"/>
+        <w:rPr>
+          <w:shd w:val="clear" w:color="auto" w:fill="FFFFFF"/>
+        </w:rPr>
+      </w:pPr>
+    </w:p>
+    <w:p>
+      <w:pPr>
+        <w:jc w:val="both"/>
+        <w:rPr>
+          <w:shd w:val="clear" w:color="auto" w:fill="FFFFFF"/>
+        </w:rPr>
+      </w:pPr>
+    </w:p>
+    <w:p>
+      <w:pPr>
+        <w:jc w:val="both"/>
+        <w:rPr>
+          <w:shd w:val="clear" w:color="auto" w:fill="FFFFFF"/>
+        </w:rPr>
+      </w:pPr>
+    </w:p>
+    <w:p>
+      <w:pPr>
+        <w:jc w:val="both"/>
+        <w:rPr>
+          <w:shd w:val="clear" w:color="auto" w:fill="FFFFFF"/>
+        </w:rPr>
+      </w:pPr>
+    </w:p>
+    <w:p>
+      <w:pPr>
+        <w:jc w:val="both"/>
+        <w:rPr>
+          <w:shd w:val="clear" w:color="auto" w:fill="FFFFFF"/>
+        </w:rPr>
+      </w:pPr>
+    </w:p>
+    <w:p>
+      <w:pPr>
+        <w:jc w:val="both"/>
+        <w:rPr>
+          <w:shd w:val="clear" w:color="auto" w:fill="FFFFFF"/>
+        </w:rPr>
+      </w:pPr>
+    </w:p>
+    <w:p>
+      <w:pPr>
+        <w:jc w:val="both"/>
+        <w:rPr>
+          <w:shd w:val="clear" w:color="auto" w:fill="FFFFFF"/>
+        </w:rPr>
+      </w:pPr>
+    </w:p>
+    <w:p>
+      <w:pPr>
+        <w:jc w:val="both"/>
+        <w:rPr>
+          <w:shd w:val="clear" w:color="auto" w:fill="FFFFFF"/>
+        </w:rPr>
+      </w:pPr>
+    </w:p>
+    <w:p>
+      <w:pPr>
+        <w:jc w:val="both"/>
+        <w:rPr>
+          <w:shd w:val="clear" w:color="auto" w:fill="FFFFFF"/>
+        </w:rPr>
+      </w:pPr>
+    </w:p>
+    <w:p>
+      <w:pPr>
+        <w:jc w:val="both"/>
+        <w:rPr>
+          <w:shd w:val="clear" w:color="auto" w:fill="FFFFFF"/>
+        </w:rPr>
+      </w:pPr>
+    </w:p>
+    <w:p>
+      <w:pPr>
+        <w:jc w:val="both"/>
+        <w:rPr>
+          <w:b/>
+          <w:bCs/>
+          <w:shd w:val="clear" w:color="auto" w:fill="FFFFFF"/>
+        </w:rPr>
+      </w:pPr>
+      <w:r>
+        <w:rPr>
+          <w:b/>
+          <w:bCs/>
+          <w:shd w:val="clear" w:color="auto" w:fill="FFFFFF"/>
+        </w:rPr>
+        <w:lastRenderedPageBreak/>
         <w:t>REQUISITOS FUNCIONAIS</w:t>
       </w:r>
     </w:p>
     <w:p>
       <w:pPr>
-        <w:rPr>
-          <w:shd w:val="clear" w:color="auto" w:fill="FFFFFF"/>
-        </w:rPr>
-      </w:pPr>
-    </w:p>
-    <w:p>
-      <w:pPr>
-        <w:rPr>
-          <w:shd w:val="clear" w:color="auto" w:fill="FFFFFF"/>
-        </w:rPr>
-      </w:pPr>
-      <w:r>
-        <w:rPr>
-          <w:shd w:val="clear" w:color="auto" w:fill="FFFFFF"/>
-        </w:rPr>
-        <w:t xml:space="preserve">Nos requisitos funcionais serão disponibilizar aos usuários a lista dos produtos que não foram comercializados no dia, e para evitar que </w:t>
+        <w:jc w:val="both"/>
+        <w:rPr>
+          <w:shd w:val="clear" w:color="auto" w:fill="FFFFFF"/>
+        </w:rPr>
+      </w:pPr>
+    </w:p>
+    <w:p>
+      <w:pPr>
+        <w:jc w:val="both"/>
+        <w:rPr>
+          <w:shd w:val="clear" w:color="auto" w:fill="FFFFFF"/>
+        </w:rPr>
+      </w:pPr>
+      <w:r>
+        <w:rPr>
+          <w:shd w:val="clear" w:color="auto" w:fill="FFFFFF"/>
+        </w:rPr>
+        <w:t xml:space="preserve">Nos requisitos funcionais devemos conseguir cadastrar e remover produtos do cardápio, informar quantidade </w:t>
       </w:r>
       <w:proofErr w:type="gramStart"/>
       <w:r>
         <w:rPr>
           <w:shd w:val="clear" w:color="auto" w:fill="FFFFFF"/>
         </w:rPr>
-        <w:t>os mesmos</w:t>
+        <w:t>e também</w:t>
       </w:r>
       <w:proofErr w:type="gramEnd"/>
       <w:r>
         <w:rPr>
           <w:shd w:val="clear" w:color="auto" w:fill="FFFFFF"/>
         </w:rPr>
-        <w:t xml:space="preserve"> fossem descartados e perdidos desenvolvemos a funcionalidade de alertas aos usuários cadastrados no sistema.</w:t>
-      </w:r>
+        <w:t xml:space="preserve"> o preço dos itens.</w:t>
+      </w:r>
+    </w:p>
+    <w:p>
+      <w:pPr>
+        <w:jc w:val="both"/>
+        <w:rPr>
+          <w:shd w:val="clear" w:color="auto" w:fill="FFFFFF"/>
+        </w:rPr>
+      </w:pPr>
+      <w:r>
+        <w:rPr>
+          <w:shd w:val="clear" w:color="auto" w:fill="FFFFFF"/>
+        </w:rPr>
+        <w:t>Implementar uma maneira de sinalizar os alunos referente aos descontos.</w:t>
+      </w:r>
+    </w:p>
+    <w:p>
+      <w:pPr>
+        <w:jc w:val="both"/>
+        <w:rPr>
+          <w:shd w:val="clear" w:color="auto" w:fill="FFFFFF"/>
+        </w:rPr>
+      </w:pPr>
+      <w:r>
+        <w:rPr>
+          <w:shd w:val="clear" w:color="auto" w:fill="FFFFFF"/>
+        </w:rPr>
+        <w:t>Até o momento foi decidido ser</w:t>
+      </w:r>
+      <w:r>
+        <w:rPr>
+          <w:shd w:val="clear" w:color="auto" w:fill="FFFFFF"/>
+        </w:rPr>
+        <w:t>mos</w:t>
+      </w:r>
+      <w:r>
+        <w:rPr>
+          <w:shd w:val="clear" w:color="auto" w:fill="FFFFFF"/>
+        </w:rPr>
+        <w:t xml:space="preserve"> simples e criar</w:t>
+      </w:r>
+      <w:r>
+        <w:rPr>
+          <w:shd w:val="clear" w:color="auto" w:fill="FFFFFF"/>
+        </w:rPr>
+        <w:t>mos</w:t>
+      </w:r>
+      <w:r>
+        <w:rPr>
+          <w:shd w:val="clear" w:color="auto" w:fill="FFFFFF"/>
+        </w:rPr>
+        <w:t xml:space="preserve"> um grupo no whatsapp para a cantina, no qual os alunos</w:t>
+      </w:r>
+      <w:r>
+        <w:rPr>
+          <w:shd w:val="clear" w:color="auto" w:fill="FFFFFF"/>
+        </w:rPr>
+        <w:t xml:space="preserve"> interessados</w:t>
+      </w:r>
+      <w:r>
+        <w:rPr>
+          <w:shd w:val="clear" w:color="auto" w:fill="FFFFFF"/>
+        </w:rPr>
+        <w:t xml:space="preserve"> participarão e o nosso aplicativo irá disparar mensagens </w:t>
+      </w:r>
+      <w:r>
+        <w:rPr>
+          <w:shd w:val="clear" w:color="auto" w:fill="FFFFFF"/>
+        </w:rPr>
+        <w:t>automáticas</w:t>
+      </w:r>
+      <w:r>
+        <w:rPr>
+          <w:shd w:val="clear" w:color="auto" w:fill="FFFFFF"/>
+        </w:rPr>
+        <w:t xml:space="preserve"> para os membros d</w:t>
+      </w:r>
+      <w:r>
+        <w:rPr>
+          <w:shd w:val="clear" w:color="auto" w:fill="FFFFFF"/>
+        </w:rPr>
+        <w:t>o</w:t>
+      </w:r>
+      <w:r>
+        <w:rPr>
+          <w:shd w:val="clear" w:color="auto" w:fill="FFFFFF"/>
+        </w:rPr>
+        <w:t xml:space="preserve"> grupo</w:t>
+      </w:r>
+      <w:r>
+        <w:rPr>
+          <w:shd w:val="clear" w:color="auto" w:fill="FFFFFF"/>
+        </w:rPr>
+        <w:t>.</w:t>
+      </w:r>
+    </w:p>
+    <w:p>
+      <w:pPr>
+        <w:jc w:val="both"/>
+        <w:rPr>
+          <w:shd w:val="clear" w:color="auto" w:fill="FFFFFF"/>
+        </w:rPr>
+      </w:pPr>
+      <w:r>
+        <w:rPr>
+          <w:shd w:val="clear" w:color="auto" w:fill="FFFFFF"/>
+        </w:rPr>
+        <w:t>A</w:t>
+      </w:r>
+      <w:r>
+        <w:rPr>
+          <w:shd w:val="clear" w:color="auto" w:fill="FFFFFF"/>
+        </w:rPr>
+        <w:t>ssim tornando opcional o cadastro dos alunos</w:t>
+      </w:r>
+      <w:r>
+        <w:rPr>
+          <w:shd w:val="clear" w:color="auto" w:fill="FFFFFF"/>
+        </w:rPr>
+        <w:t>, permitindo que eles usem o sistema mesmo que tenham decidido não se cadastrar, ou caso tenha decidido se cadastrar, poderem usar antes mesmo de fazer o cadastro.</w:t>
+      </w:r>
+      <w:r>
+        <w:rPr>
+          <w:shd w:val="clear" w:color="auto" w:fill="FFFFFF"/>
+        </w:rPr>
+        <w:t xml:space="preserve"> </w:t>
+      </w:r>
+    </w:p>
+    <w:p>
+      <w:pPr>
+        <w:jc w:val="both"/>
+        <w:rPr>
+          <w:shd w:val="clear" w:color="auto" w:fill="FFFFFF"/>
+        </w:rPr>
+      </w:pPr>
+      <w:r>
+        <w:rPr>
+          <w:shd w:val="clear" w:color="auto" w:fill="FFFFFF"/>
+        </w:rPr>
+        <w:t>Desta forma acreditamos</w:t>
+      </w:r>
+      <w:r>
+        <w:rPr>
+          <w:shd w:val="clear" w:color="auto" w:fill="FFFFFF"/>
+        </w:rPr>
+        <w:t xml:space="preserve"> </w:t>
+      </w:r>
+      <w:r>
+        <w:rPr>
+          <w:shd w:val="clear" w:color="auto" w:fill="FFFFFF"/>
+        </w:rPr>
+        <w:t>aumentar a adotabilidade do sistema</w:t>
+      </w:r>
+      <w:r>
+        <w:rPr>
+          <w:shd w:val="clear" w:color="auto" w:fill="FFFFFF"/>
+        </w:rPr>
+        <w:t>, tanto para os funcionários da cantina, que não terão o trabalho de cadastrar alunos, quanto para os alunos, que também não serão obrigados a se</w:t>
+      </w:r>
+      <w:r>
+        <w:rPr>
+          <w:shd w:val="clear" w:color="auto" w:fill="FFFFFF"/>
+        </w:rPr>
+        <w:t xml:space="preserve"> </w:t>
+      </w:r>
+      <w:r>
+        <w:rPr>
+          <w:shd w:val="clear" w:color="auto" w:fill="FFFFFF"/>
+        </w:rPr>
+        <w:t>cadastra</w:t>
+      </w:r>
+      <w:r>
+        <w:rPr>
+          <w:shd w:val="clear" w:color="auto" w:fill="FFFFFF"/>
+        </w:rPr>
+        <w:t>rem para utilizar o sistema</w:t>
+      </w:r>
+      <w:r>
+        <w:rPr>
+          <w:shd w:val="clear" w:color="auto" w:fill="FFFFFF"/>
+        </w:rPr>
+        <w:t>.</w:t>
+      </w:r>
+    </w:p>
+    <w:p>
+      <w:pPr>
+        <w:jc w:val="both"/>
+        <w:rPr>
+          <w:shd w:val="clear" w:color="auto" w:fill="FFFFFF"/>
+        </w:rPr>
+      </w:pPr>
+      <w:r>
+        <w:rPr>
+          <w:shd w:val="clear" w:color="auto" w:fill="FFFFFF"/>
+        </w:rPr>
+        <w:t>Quanto mais fácil para as pessoas, mais fácil será de sermos aceitos.</w:t>
+      </w:r>
+    </w:p>
+    <w:p>
+      <w:pPr>
+        <w:jc w:val="both"/>
+        <w:rPr>
+          <w:shd w:val="clear" w:color="auto" w:fill="FFFFFF"/>
+        </w:rPr>
+      </w:pPr>
+    </w:p>
+    <w:p>
+      <w:pPr>
+        <w:jc w:val="both"/>
+        <w:rPr>
+          <w:shd w:val="clear" w:color="auto" w:fill="FFFFFF"/>
+        </w:rPr>
+      </w:pPr>
+      <w:r>
+        <w:rPr>
+          <w:shd w:val="clear" w:color="auto" w:fill="FFFFFF"/>
+        </w:rPr>
+        <w:t>Caso seja viável e o tempo permita, adicionaremos a funcionalidade de poder comprar e pagar sem ter de sair da sala.</w:t>
+      </w:r>
+    </w:p>
+    <w:p>
+      <w:pPr>
+        <w:jc w:val="both"/>
+        <w:rPr>
+          <w:shd w:val="clear" w:color="auto" w:fill="FFFFFF"/>
+        </w:rPr>
+      </w:pPr>
+      <w:r>
+        <w:rPr>
+          <w:shd w:val="clear" w:color="auto" w:fill="FFFFFF"/>
+        </w:rPr>
+        <w:t xml:space="preserve">Para poupar tempo e evitar que os funcionários da cantina esqueçam/desistam/optem por não usar nossa aplicação, decidimos que as ofertas devem ser automáticas, sem trabalho manual por parte dos funcionários, isto é, o sistema ter acesso aos itens disponíveis naquele dia, conseguir dar baixa nos itens sem que uma pessoa tenha de ir manualmente </w:t>
+      </w:r>
+      <w:r>
+        <w:rPr>
+          <w:shd w:val="clear" w:color="auto" w:fill="FFFFFF"/>
+        </w:rPr>
+        <w:t>sinalizar que o produto foi vendido, conseguir calcular a quantidade disponível e disponibilizar a oferta sem que algum funcionário tenha de contar os produtos que não foram vendidos manualmente e listar as quantidades sobrantes. O sistema deve fazer isso automaticamente.</w:t>
+      </w:r>
+    </w:p>
+    <w:p>
+      <w:pPr>
+        <w:rPr>
+          <w:shd w:val="clear" w:color="auto" w:fill="FFFFFF"/>
+        </w:rPr>
+      </w:pPr>
     </w:p>
     <w:p>
       <w:pPr>
@@ -871,16 +1398,14 @@
               <w:rPr>
                 <w:shd w:val="clear" w:color="auto" w:fill="FFFFFF"/>
               </w:rPr>
-              <w:t xml:space="preserve">Notificação automática </w:t>
+              <w:t>Notificação automática no horário</w:t>
             </w:r>
-            <w:proofErr w:type="gramStart"/>
             <w:r>
               <w:rPr>
                 <w:shd w:val="clear" w:color="auto" w:fill="FFFFFF"/>
               </w:rPr>
-              <w:t>no horários</w:t>
+              <w:t xml:space="preserve"> da queima de estoque</w:t>
             </w:r>
-            <w:proofErr w:type="gramEnd"/>
           </w:p>
         </w:tc>
       </w:tr>
@@ -920,6 +1445,12 @@
               <w:rPr>
                 <w:shd w:val="clear" w:color="auto" w:fill="FFFFFF"/>
               </w:rPr>
+              <w:t xml:space="preserve">Informar pelo </w:t>
+            </w:r>
+            <w:r>
+              <w:rPr>
+                <w:shd w:val="clear" w:color="auto" w:fill="FFFFFF"/>
+              </w:rPr>
               <w:t>Whatsapp</w:t>
             </w:r>
           </w:p>
@@ -993,6 +1524,7 @@
         <w:rPr>
           <w:shd w:val="clear" w:color="auto" w:fill="FFFFFF"/>
         </w:rPr>
+        <w:lastRenderedPageBreak/>
         <w:t>REQUISITOS NÃO FUNCIONAIS</w:t>
       </w:r>
     </w:p>
@@ -1135,7 +1667,6 @@
               <w:rPr>
                 <w:shd w:val="clear" w:color="auto" w:fill="FFFFFF"/>
               </w:rPr>
-              <w:lastRenderedPageBreak/>
               <w:t>RNF001</w:t>
             </w:r>
           </w:p>
@@ -1462,6 +1993,7 @@
           <w:noProof/>
           <w:shd w:val="clear" w:color="auto" w:fill="FFFFFF"/>
         </w:rPr>
+        <w:lastRenderedPageBreak/>
         <w:drawing>
           <wp:inline distT="0" distB="0" distL="0" distR="0" wp14:anchorId="1F51E123" wp14:editId="2336D183">
             <wp:extent cx="2276793" cy="1867161"/>
@@ -1564,14 +2096,7 @@
         <w:rPr>
           <w:shd w:val="clear" w:color="auto" w:fill="FFFFFF"/>
         </w:rPr>
-        <w:t xml:space="preserve">No banco de dados devem ser descritas as estruturas responsáveis pelo armazenamento e organização das informações do sistema. É importante apresentar </w:t>
-      </w:r>
-      <w:r>
-        <w:rPr>
-          <w:shd w:val="clear" w:color="auto" w:fill="FFFFFF"/>
-        </w:rPr>
-        <w:lastRenderedPageBreak/>
-        <w:t>as tabelas que serão utilizadas, os principais campos de cada tabela, os tipos de dados, os relacionamentos entre as entidades e as regras de integridade dos dados. Também podem ser incluídos o modelo entidade-relacionamento (MER), diagramas do banco, chaves primárias e estrangeiras, além da justificativa da tecnologia escolhida para o gerenciamento do banco de dados. O objetivo é demonstrar como os dados serão armazenados, relacionados e manipulados para garantir o funcionamento correto do sistema.</w:t>
+        <w:t>No banco de dados devem ser descritas as estruturas responsáveis pelo armazenamento e organização das informações do sistema. É importante apresentar as tabelas que serão utilizadas, os principais campos de cada tabela, os tipos de dados, os relacionamentos entre as entidades e as regras de integridade dos dados. Também podem ser incluídos o modelo entidade-relacionamento (MER), diagramas do banco, chaves primárias e estrangeiras, além da justificativa da tecnologia escolhida para o gerenciamento do banco de dados. O objetivo é demonstrar como os dados serão armazenados, relacionados e manipulados para garantir o funcionamento correto do sistema.</w:t>
       </w:r>
     </w:p>
     <w:p>
@@ -1793,14 +2318,7 @@
         <w:rPr>
           <w:shd w:val="clear" w:color="auto" w:fill="FFFFFF"/>
         </w:rPr>
-        <w:t xml:space="preserve">Na conclusão devem ser apresentados os resultados obtidos com o desenvolvimento do projeto integrador, destacando se os objetivos propostos foram alcançados e quais </w:t>
-      </w:r>
-      <w:r>
-        <w:rPr>
-          <w:shd w:val="clear" w:color="auto" w:fill="FFFFFF"/>
-        </w:rPr>
-        <w:lastRenderedPageBreak/>
-        <w:t>benefícios a solução desenvolvida pode oferecer. Também podem ser descritas as principais dificuldades encontradas durante o projeto, os conhecimentos adquiridos pela equipe, as melhorias implementadas e possíveis sugestões para trabalhos futuros ou expansão do sistema. A conclusão deve sintetizar o trabalho realizado, demonstrando a importância do projeto e os aprendizados obtidos ao longo do desenvolvimento.</w:t>
+        <w:t>Na conclusão devem ser apresentados os resultados obtidos com o desenvolvimento do projeto integrador, destacando se os objetivos propostos foram alcançados e quais benefícios a solução desenvolvida pode oferecer. Também podem ser descritas as principais dificuldades encontradas durante o projeto, os conhecimentos adquiridos pela equipe, as melhorias implementadas e possíveis sugestões para trabalhos futuros ou expansão do sistema. A conclusão deve sintetizar o trabalho realizado, demonstrando a importância do projeto e os aprendizados obtidos ao longo do desenvolvimento.</w:t>
       </w:r>
     </w:p>
     <w:p>
@@ -3153,7 +3671,12 @@
 </file>
 
 <file path=customXml/item1.xml><?xml version="1.0" encoding="utf-8"?>
-<b:Sources xmlns:b="http://schemas.openxmlformats.org/officeDocument/2006/bibliography" xmlns="http://schemas.openxmlformats.org/officeDocument/2006/bibliography" SelectedStyle="\APASixthEditionOfficeOnline.xsl" StyleName="APA" Version="6"/>
+<?mso-contentType ?>
+<FormTemplates xmlns="http://schemas.microsoft.com/sharepoint/v3/contenttype/forms">
+  <Display>DocumentLibraryForm</Display>
+  <Edit>DocumentLibraryForm</Edit>
+  <New>DocumentLibraryForm</New>
+</FormTemplates>
 </file>
 
 <file path=customXml/item2.xml><?xml version="1.0" encoding="utf-8"?>
@@ -3163,12 +3686,7 @@
 </file>
 
 <file path=customXml/item3.xml><?xml version="1.0" encoding="utf-8"?>
-<?mso-contentType ?>
-<FormTemplates xmlns="http://schemas.microsoft.com/sharepoint/v3/contenttype/forms">
-  <Display>DocumentLibraryForm</Display>
-  <Edit>DocumentLibraryForm</Edit>
-  <New>DocumentLibraryForm</New>
-</FormTemplates>
+<b:Sources xmlns:b="http://schemas.openxmlformats.org/officeDocument/2006/bibliography" xmlns="http://schemas.openxmlformats.org/officeDocument/2006/bibliography" SelectedStyle="\APASixthEditionOfficeOnline.xsl" StyleName="APA" Version="6"/>
 </file>
 
 <file path=customXml/item4.xml><?xml version="1.0" encoding="utf-8"?>
@@ -3334,9 +3852,9 @@
 </file>
 
 <file path=customXml/itemProps1.xml><?xml version="1.0" encoding="utf-8"?>
-<ds:datastoreItem xmlns:ds="http://schemas.openxmlformats.org/officeDocument/2006/customXml" ds:itemID="{772F3EFC-3779-4746-88D3-58DA537A0FE3}">
+<ds:datastoreItem xmlns:ds="http://schemas.openxmlformats.org/officeDocument/2006/customXml" ds:itemID="{C58FEC9C-144D-45EC-B31E-AE7509DBB36D}">
   <ds:schemaRefs>
-    <ds:schemaRef ds:uri="http://schemas.openxmlformats.org/officeDocument/2006/bibliography"/>
+    <ds:schemaRef ds:uri="http://schemas.microsoft.com/sharepoint/v3/contenttype/forms"/>
   </ds:schemaRefs>
 </ds:datastoreItem>
 </file>
@@ -3351,9 +3869,9 @@
 </file>
 
 <file path=customXml/itemProps3.xml><?xml version="1.0" encoding="utf-8"?>
-<ds:datastoreItem xmlns:ds="http://schemas.openxmlformats.org/officeDocument/2006/customXml" ds:itemID="{C58FEC9C-144D-45EC-B31E-AE7509DBB36D}">
+<ds:datastoreItem xmlns:ds="http://schemas.openxmlformats.org/officeDocument/2006/customXml" ds:itemID="{772F3EFC-3779-4746-88D3-58DA537A0FE3}">
   <ds:schemaRefs>
-    <ds:schemaRef ds:uri="http://schemas.microsoft.com/sharepoint/v3/contenttype/forms"/>
+    <ds:schemaRef ds:uri="http://schemas.openxmlformats.org/officeDocument/2006/bibliography"/>
   </ds:schemaRefs>
 </ds:datastoreItem>
 </file>

</xml_diff>